<commit_message>
Shorten evidence paths to max 97 chars (v4 package) and update guide
Folder and file names shortened further so the package extracts even into
long OneDrive/SharePoint destinations; workpaper, README and user guide
citations updated. Removes a stray empty nested folder entry.

Co-Authored-By: Claude Opus 5.5 <noreply@anthropic.com>
Claude-Session: https://claude.ai/code/session_01EvPShiyEmxF7seMC9F3Gzj
</commit_message>
<xml_diff>
--- a/BSI.IT.6.C7.3_Workpaper_and_Evidence_User_Guide.docx
+++ b/BSI.IT.6.C7.3_Workpaper_and_Evidence_User_Guide.docx
@@ -491,7 +491,7 @@
                 <w:sz w:val="19"/>
                 <w:szCs w:val="19"/>
               </w:rPr>
-              <w:t xml:space="preserve">BSI.IT.6.C7_FINAL.zip</w:t>
+              <w:t xml:space="preserve">BSI.IT.6.C7_FINAL_v4.zip</w:t>
             </w:r>
           </w:p>
         </w:tc>
@@ -665,7 +665,7 @@
           <w:sz w:val="19"/>
           <w:szCs w:val="19"/>
         </w:rPr>
-        <w:t xml:space="preserve">BSI.IT.6.C7_FINAL.zip</w:t>
+        <w:t xml:space="preserve">BSI.IT.6.C7_FINAL_v4.zip</w:t>
       </w:r>
       <w:r>
         <w:rPr>
@@ -902,7 +902,7 @@
                 <w:sz w:val="21"/>
                 <w:szCs w:val="21"/>
               </w:rPr>
-              <w:t xml:space="preserve"> Windows limits a full file path to 260 characters. The longest path inside the package is 135 characters, so extracting to a short folder such as </w:t>
+              <w:t xml:space="preserve"> Windows limits a full file path to 260 characters. The longest path inside the package is 97 characters, so it extracts even into long OneDrive or SharePoint folders; a short folder such as </w:t>
             </w:r>
             <w:r>
               <w:rPr>
@@ -919,7 +919,7 @@
                 <w:sz w:val="21"/>
                 <w:szCs w:val="21"/>
               </w:rPr>
-              <w:t xml:space="preserve"> leaves plenty of room. Deeply nested locations (for example inside OneDrive or a long Downloads subfolder) can bring back the “Error 0x80010135: Path too long” message.</w:t>
+              <w:t xml:space="preserve"> is still the safest choice. Deeply nested locations (for example inside OneDrive or a long Downloads subfolder) can bring back the “Error 0x80010135: Path too long” message.</w:t>
             </w:r>
           </w:p>
         </w:tc>
@@ -1144,7 +1144,7 @@
                 <w:sz w:val="19"/>
                 <w:szCs w:val="19"/>
               </w:rPr>
-              <w:t xml:space="preserve">01_Mgmt_Attestation_InScope_Apps</w:t>
+              <w:t xml:space="preserve">01_MA_InScope_Apps</w:t>
             </w:r>
           </w:p>
         </w:tc>
@@ -1259,7 +1259,7 @@
                 <w:sz w:val="19"/>
                 <w:szCs w:val="19"/>
               </w:rPr>
-              <w:t xml:space="preserve">02_BL_Approval_Results</w:t>
+              <w:t xml:space="preserve">02_BLA_Results</w:t>
             </w:r>
           </w:p>
         </w:tc>
@@ -1376,7 +1376,7 @@
                 <w:sz w:val="19"/>
                 <w:szCs w:val="19"/>
               </w:rPr>
-              <w:t xml:space="preserve">03_DIV_Mgr_Attestations</w:t>
+              <w:t xml:space="preserve">03_DMA_Mgr_Approvals</w:t>
             </w:r>
           </w:p>
         </w:tc>
@@ -1491,7 +1491,7 @@
                 <w:sz w:val="19"/>
                 <w:szCs w:val="19"/>
               </w:rPr>
-              <w:t xml:space="preserve">04_DI_and_Email_Evidence</w:t>
+              <w:t xml:space="preserve">04_E_DI_Evidence</w:t>
             </w:r>
           </w:p>
         </w:tc>
@@ -4310,7 +4310,7 @@
           <w:sz w:val="19"/>
           <w:szCs w:val="19"/>
         </w:rPr>
-        <w:t xml:space="preserve">E03 – BSI.IT.6.C7.3-Evidences\04_DI_and_Email_Evidence\BSI.IT.6.C7.3_E03_All Data Integrity Validation Testing_FV.xls – row 47</w:t>
+        <w:t xml:space="preserve">E03 – BSI.IT.6.C7.3-Evidences\04_E_DI_Evidence\E03_BCiC All DIV Testing_FV.xls – row 47</w:t>
       </w:r>
     </w:p>
     <w:p>
@@ -4358,7 +4358,7 @@
           <w:sz w:val="21"/>
           <w:szCs w:val="21"/>
         </w:rPr>
-        <w:t xml:space="preserve">04_DI_and_Email_Evidence</w:t>
+        <w:t xml:space="preserve">04_E_DI_Evidence</w:t>
       </w:r>
       <w:r>
         <w:rPr>
@@ -8069,15 +8069,67 @@
                 <w:sz w:val="19"/>
                 <w:szCs w:val="19"/>
               </w:rPr>
-              <w:t xml:space="preserve">BSI.IT.6.C7_FINAL.zip</w:t>
-            </w:r>
-            <w:r>
-              <w:rPr>
-                <w:rFonts w:ascii="Calibri" w:cs="Calibri" w:eastAsia="Calibri" w:hAnsi="Calibri"/>
-                <w:sz w:val="21"/>
-                <w:szCs w:val="21"/>
-              </w:rPr>
-              <w:t xml:space="preserve"> (the rebuilt single zip), not the older zip that contained another zip.</w:t>
+              <w:t xml:space="preserve">BSI.IT.6.C7_FINAL_v4.zip</w:t>
+            </w:r>
+            <w:r>
+              <w:rPr>
+                <w:rFonts w:ascii="Calibri" w:cs="Calibri" w:eastAsia="Calibri" w:hAnsi="Calibri"/>
+                <w:sz w:val="21"/>
+                <w:szCs w:val="21"/>
+              </w:rPr>
+              <w:t xml:space="preserve">. If the error names a file starting with </w:t>
+            </w:r>
+            <w:r>
+              <w:rPr>
+                <w:rFonts w:ascii="Consolas" w:cs="Consolas" w:eastAsia="Consolas" w:hAnsi="Consolas"/>
+                <w:color w:val="2F5496"/>
+                <w:sz w:val="19"/>
+                <w:szCs w:val="19"/>
+              </w:rPr>
+              <w:t xml:space="preserve">DMA06_RE_ Management Attestation</w:t>
+            </w:r>
+            <w:r>
+              <w:rPr>
+                <w:rFonts w:ascii="Calibri" w:cs="Calibri" w:eastAsia="Calibri" w:hAnsi="Calibri"/>
+                <w:sz w:val="21"/>
+                <w:szCs w:val="21"/>
+              </w:rPr>
+              <w:t xml:space="preserve">, it is coming from an </w:t>
+            </w:r>
+            <w:r>
+              <w:rPr>
+                <w:rFonts w:ascii="Calibri" w:cs="Calibri" w:eastAsia="Calibri" w:hAnsi="Calibri"/>
+                <w:b/>
+                <w:bCs/>
+                <w:sz w:val="21"/>
+                <w:szCs w:val="21"/>
+              </w:rPr>
+              <w:t xml:space="preserve">old copy</w:t>
+            </w:r>
+            <w:r>
+              <w:rPr>
+                <w:rFonts w:ascii="Calibri" w:cs="Calibri" w:eastAsia="Calibri" w:hAnsi="Calibri"/>
+                <w:sz w:val="21"/>
+                <w:szCs w:val="21"/>
+              </w:rPr>
+              <w:t xml:space="preserve">: delete every older zip and previously extracted </w:t>
+            </w:r>
+            <w:r>
+              <w:rPr>
+                <w:rFonts w:ascii="Consolas" w:cs="Consolas" w:eastAsia="Consolas" w:hAnsi="Consolas"/>
+                <w:color w:val="2F5496"/>
+                <w:sz w:val="19"/>
+                <w:szCs w:val="19"/>
+              </w:rPr>
+              <w:t xml:space="preserve">BSI.IT.6.C7.3-Evidences</w:t>
+            </w:r>
+            <w:r>
+              <w:rPr>
+                <w:rFonts w:ascii="Calibri" w:cs="Calibri" w:eastAsia="Calibri" w:hAnsi="Calibri"/>
+                <w:sz w:val="21"/>
+                <w:szCs w:val="21"/>
+              </w:rPr>
+              <w:t xml:space="preserve"> folder, then extract v4 into an empty folder.</w:t>
             </w:r>
           </w:p>
         </w:tc>
@@ -8147,7 +8199,7 @@
                 <w:sz w:val="19"/>
                 <w:szCs w:val="19"/>
               </w:rPr>
-              <w:t xml:space="preserve">BSI.IT.6.C7_FINAL.zip</w:t>
+              <w:t xml:space="preserve">BSI.IT.6.C7_FINAL_v4.zip</w:t>
             </w:r>
             <w:r>
               <w:rPr>

</xml_diff>

<commit_message>
Evidence package v5: max path 49 chars so it extracts from any user folder
Folder and file names reduced to reference + short tag; workpaper renamed
E00_Workpaper_DR_DIV.xlsx; workpaper, README and guide citations updated.

Co-Authored-By: Claude Opus 5.5 <noreply@anthropic.com>
Claude-Session: https://claude.ai/code/session_01EvPShiyEmxF7seMC9F3Gzj
</commit_message>
<xml_diff>
--- a/BSI.IT.6.C7.3_Workpaper_and_Evidence_User_Guide.docx
+++ b/BSI.IT.6.C7.3_Workpaper_and_Evidence_User_Guide.docx
@@ -491,7 +491,7 @@
                 <w:sz w:val="19"/>
                 <w:szCs w:val="19"/>
               </w:rPr>
-              <w:t xml:space="preserve">BSI.IT.6.C7_FINAL_v4.zip</w:t>
+              <w:t xml:space="preserve">C7_v5.zip</w:t>
             </w:r>
           </w:p>
         </w:tc>
@@ -551,7 +551,7 @@
                 <w:sz w:val="19"/>
                 <w:szCs w:val="19"/>
               </w:rPr>
-              <w:t xml:space="preserve">BSI.IT.6.C7.3_E00_Workpaper_DR_DIV_INTEGRATED_APPLICATION_Evidence.xlsx</w:t>
+              <w:t xml:space="preserve">E00_Workpaper_DR_DIV.xlsx</w:t>
             </w:r>
           </w:p>
         </w:tc>
@@ -665,15 +665,33 @@
           <w:sz w:val="19"/>
           <w:szCs w:val="19"/>
         </w:rPr>
-        <w:t xml:space="preserve">BSI.IT.6.C7_FINAL_v4.zip</w:t>
-      </w:r>
-      <w:r>
-        <w:rPr>
-          <w:rFonts w:ascii="Calibri" w:cs="Calibri" w:eastAsia="Calibri" w:hAnsi="Calibri"/>
-          <w:sz w:val="21"/>
-          <w:szCs w:val="21"/>
-        </w:rPr>
-        <w:t xml:space="preserve"> to your computer.</w:t>
+        <w:t xml:space="preserve">C7_v5.zip</w:t>
+      </w:r>
+      <w:r>
+        <w:rPr>
+          <w:rFonts w:ascii="Calibri" w:cs="Calibri" w:eastAsia="Calibri" w:hAnsi="Calibri"/>
+          <w:sz w:val="21"/>
+          <w:szCs w:val="21"/>
+        </w:rPr>
+        <w:t xml:space="preserve"> to your </w:t>
+      </w:r>
+      <w:r>
+        <w:rPr>
+          <w:rFonts w:ascii="Calibri" w:cs="Calibri" w:eastAsia="Calibri" w:hAnsi="Calibri"/>
+          <w:b/>
+          <w:bCs/>
+          <w:sz w:val="21"/>
+          <w:szCs w:val="21"/>
+        </w:rPr>
+        <w:t xml:space="preserve">Downloads</w:t>
+      </w:r>
+      <w:r>
+        <w:rPr>
+          <w:rFonts w:ascii="Calibri" w:cs="Calibri" w:eastAsia="Calibri" w:hAnsi="Calibri"/>
+          <w:sz w:val="21"/>
+          <w:szCs w:val="21"/>
+        </w:rPr>
+        <w:t xml:space="preserve"> folder (or Documents / Desktop – any folder you can write to).</w:t>
       </w:r>
     </w:p>
     <w:p>
@@ -691,7 +709,7 @@
           <w:sz w:val="21"/>
           <w:szCs w:val="21"/>
         </w:rPr>
-        <w:t xml:space="preserve">Create a short folder, for example </w:t>
+        <w:t xml:space="preserve">Delete any older copies first: every </w:t>
       </w:r>
       <w:r>
         <w:rPr>
@@ -700,15 +718,15 @@
           <w:sz w:val="19"/>
           <w:szCs w:val="19"/>
         </w:rPr>
-        <w:t xml:space="preserve">C:\Audit\</w:t>
-      </w:r>
-      <w:r>
-        <w:rPr>
-          <w:rFonts w:ascii="Calibri" w:cs="Calibri" w:eastAsia="Calibri" w:hAnsi="Calibri"/>
-          <w:sz w:val="21"/>
-          <w:szCs w:val="21"/>
-        </w:rPr>
-        <w:t xml:space="preserve">.</w:t>
+        <w:t xml:space="preserve">BSI.IT.6.C7…</w:t>
+      </w:r>
+      <w:r>
+        <w:rPr>
+          <w:rFonts w:ascii="Calibri" w:cs="Calibri" w:eastAsia="Calibri" w:hAnsi="Calibri"/>
+          <w:sz w:val="21"/>
+          <w:szCs w:val="21"/>
+        </w:rPr>
+        <w:t xml:space="preserve"> zip and any previously extracted evidence folder.</w:t>
       </w:r>
     </w:p>
     <w:p>
@@ -726,25 +744,7 @@
           <w:sz w:val="21"/>
           <w:szCs w:val="21"/>
         </w:rPr>
-        <w:t xml:space="preserve">Right-click the zip → </w:t>
-      </w:r>
-      <w:r>
-        <w:rPr>
-          <w:rFonts w:ascii="Calibri" w:cs="Calibri" w:eastAsia="Calibri" w:hAnsi="Calibri"/>
-          <w:b/>
-          <w:bCs/>
-          <w:sz w:val="21"/>
-          <w:szCs w:val="21"/>
-        </w:rPr>
-        <w:t xml:space="preserve">Extract All…</w:t>
-      </w:r>
-      <w:r>
-        <w:rPr>
-          <w:rFonts w:ascii="Calibri" w:cs="Calibri" w:eastAsia="Calibri" w:hAnsi="Calibri"/>
-          <w:sz w:val="21"/>
-          <w:szCs w:val="21"/>
-        </w:rPr>
-        <w:t xml:space="preserve"> → choose </w:t>
+        <w:t xml:space="preserve">Right-click </w:t>
       </w:r>
       <w:r>
         <w:rPr>
@@ -753,7 +753,7 @@
           <w:sz w:val="19"/>
           <w:szCs w:val="19"/>
         </w:rPr>
-        <w:t xml:space="preserve">C:\Audit\</w:t>
+        <w:t xml:space="preserve">C7_v5.zip</w:t>
       </w:r>
       <w:r>
         <w:rPr>
@@ -762,6 +762,24 @@
           <w:szCs w:val="21"/>
         </w:rPr>
         <w:t xml:space="preserve"> → </w:t>
+      </w:r>
+      <w:r>
+        <w:rPr>
+          <w:rFonts w:ascii="Calibri" w:cs="Calibri" w:eastAsia="Calibri" w:hAnsi="Calibri"/>
+          <w:b/>
+          <w:bCs/>
+          <w:sz w:val="21"/>
+          <w:szCs w:val="21"/>
+        </w:rPr>
+        <w:t xml:space="preserve">Extract All…</w:t>
+      </w:r>
+      <w:r>
+        <w:rPr>
+          <w:rFonts w:ascii="Calibri" w:cs="Calibri" w:eastAsia="Calibri" w:hAnsi="Calibri"/>
+          <w:sz w:val="21"/>
+          <w:szCs w:val="21"/>
+        </w:rPr>
+        <w:t xml:space="preserve"> → keep the suggested location → </w:t>
       </w:r>
       <w:r>
         <w:rPr>
@@ -797,7 +815,7 @@
           <w:sz w:val="21"/>
           <w:szCs w:val="21"/>
         </w:rPr>
-        <w:t xml:space="preserve">Open </w:t>
+        <w:t xml:space="preserve">Open the new </w:t>
       </w:r>
       <w:r>
         <w:rPr>
@@ -806,15 +824,15 @@
           <w:sz w:val="19"/>
           <w:szCs w:val="19"/>
         </w:rPr>
-        <w:t xml:space="preserve">C:\Audit\BSI.IT.6.C7.3-Evidences\</w:t>
-      </w:r>
-      <w:r>
-        <w:rPr>
-          <w:rFonts w:ascii="Calibri" w:cs="Calibri" w:eastAsia="Calibri" w:hAnsi="Calibri"/>
-          <w:sz w:val="21"/>
-          <w:szCs w:val="21"/>
-        </w:rPr>
-        <w:t xml:space="preserve">. You should see the workpaper, </w:t>
+        <w:t xml:space="preserve">C7_v5\C7.3_Evidence\</w:t>
+      </w:r>
+      <w:r>
+        <w:rPr>
+          <w:rFonts w:ascii="Calibri" w:cs="Calibri" w:eastAsia="Calibri" w:hAnsi="Calibri"/>
+          <w:sz w:val="21"/>
+          <w:szCs w:val="21"/>
+        </w:rPr>
+        <w:t xml:space="preserve"> folder. You should see the workpaper, </w:t>
       </w:r>
       <w:r>
         <w:rPr>
@@ -894,32 +912,33 @@
                 <w:sz w:val="21"/>
                 <w:szCs w:val="21"/>
               </w:rPr>
-              <w:t xml:space="preserve">Why a short path?</w:t>
-            </w:r>
-            <w:r>
-              <w:rPr>
-                <w:rFonts w:ascii="Calibri" w:cs="Calibri" w:eastAsia="Calibri" w:hAnsi="Calibri"/>
-                <w:sz w:val="21"/>
-                <w:szCs w:val="21"/>
-              </w:rPr>
-              <w:t xml:space="preserve"> Windows limits a full file path to 260 characters. The longest path inside the package is 97 characters, so it extracts even into long OneDrive or SharePoint folders; a short folder such as </w:t>
-            </w:r>
-            <w:r>
-              <w:rPr>
-                <w:rFonts w:ascii="Consolas" w:cs="Consolas" w:eastAsia="Consolas" w:hAnsi="Consolas"/>
-                <w:color w:val="2F5496"/>
-                <w:sz w:val="19"/>
-                <w:szCs w:val="19"/>
-              </w:rPr>
-              <w:t xml:space="preserve">C:\Audit\</w:t>
-            </w:r>
-            <w:r>
-              <w:rPr>
-                <w:rFonts w:ascii="Calibri" w:cs="Calibri" w:eastAsia="Calibri" w:hAnsi="Calibri"/>
-                <w:sz w:val="21"/>
-                <w:szCs w:val="21"/>
-              </w:rPr>
-              <w:t xml:space="preserve"> is still the safest choice. Deeply nested locations (for example inside OneDrive or a long Downloads subfolder) can bring back the “Error 0x80010135: Path too long” message.</w:t>
+              <w:t xml:space="preserve">Why short names?</w:t>
+            </w:r>
+            <w:r>
+              <w:rPr>
+                <w:rFonts w:ascii="Calibri" w:cs="Calibri" w:eastAsia="Calibri" w:hAnsi="Calibri"/>
+                <w:sz w:val="21"/>
+                <w:szCs w:val="21"/>
+              </w:rPr>
+              <w:t xml:space="preserve"> Windows limits a full file path to 260 characters. The longest path inside the package is only 49 characters, so it extracts into Downloads, Documents, Desktop or a OneDrive folder without the “Error 0x80010135: Path too long” message. Do not drag files out of the zip window – always use </w:t>
+            </w:r>
+            <w:r>
+              <w:rPr>
+                <w:rFonts w:ascii="Calibri" w:cs="Calibri" w:eastAsia="Calibri" w:hAnsi="Calibri"/>
+                <w:b/>
+                <w:bCs/>
+                <w:sz w:val="21"/>
+                <w:szCs w:val="21"/>
+              </w:rPr>
+              <w:t xml:space="preserve">Extract All</w:t>
+            </w:r>
+            <w:r>
+              <w:rPr>
+                <w:rFonts w:ascii="Calibri" w:cs="Calibri" w:eastAsia="Calibri" w:hAnsi="Calibri"/>
+                <w:sz w:val="21"/>
+                <w:szCs w:val="21"/>
+              </w:rPr>
+              <w:t xml:space="preserve">.</w:t>
             </w:r>
           </w:p>
         </w:tc>
@@ -1144,7 +1163,7 @@
                 <w:sz w:val="19"/>
                 <w:szCs w:val="19"/>
               </w:rPr>
-              <w:t xml:space="preserve">01_MA_InScope_Apps</w:t>
+              <w:t xml:space="preserve">01_MA</w:t>
             </w:r>
           </w:p>
         </w:tc>
@@ -1259,7 +1278,7 @@
                 <w:sz w:val="19"/>
                 <w:szCs w:val="19"/>
               </w:rPr>
-              <w:t xml:space="preserve">02_BLA_Results</w:t>
+              <w:t xml:space="preserve">02_BLA</w:t>
             </w:r>
           </w:p>
         </w:tc>
@@ -1376,7 +1395,7 @@
                 <w:sz w:val="19"/>
                 <w:szCs w:val="19"/>
               </w:rPr>
-              <w:t xml:space="preserve">03_DMA_Mgr_Approvals</w:t>
+              <w:t xml:space="preserve">03_DMA</w:t>
             </w:r>
           </w:p>
         </w:tc>
@@ -1491,7 +1510,7 @@
                 <w:sz w:val="19"/>
                 <w:szCs w:val="19"/>
               </w:rPr>
-              <w:t xml:space="preserve">04_E_DI_Evidence</w:t>
+              <w:t xml:space="preserve">04_E</w:t>
             </w:r>
           </w:p>
         </w:tc>
@@ -1861,7 +1880,7 @@
           <w:sz w:val="19"/>
           <w:szCs w:val="19"/>
         </w:rPr>
-        <w:t xml:space="preserve">BSI.IT.6.C7.3_E00_Workpaper_DR_DIV_INTEGRATED_APPLICATION_Evidence.xlsx</w:t>
+        <w:t xml:space="preserve">E00_Workpaper_DR_DIV.xlsx</w:t>
       </w:r>
       <w:r>
         <w:rPr>
@@ -4310,7 +4329,7 @@
           <w:sz w:val="19"/>
           <w:szCs w:val="19"/>
         </w:rPr>
-        <w:t xml:space="preserve">E03 – BSI.IT.6.C7.3-Evidences\04_E_DI_Evidence\E03_BCiC All DIV Testing_FV.xls – row 47</w:t>
+        <w:t xml:space="preserve">E03 – C7.3_Evidence\04_E\E03_DIV_Testing.xls – row 47</w:t>
       </w:r>
     </w:p>
     <w:p>
@@ -4358,7 +4377,7 @@
           <w:sz w:val="21"/>
           <w:szCs w:val="21"/>
         </w:rPr>
-        <w:t xml:space="preserve">04_E_DI_Evidence</w:t>
+        <w:t xml:space="preserve">04_E</w:t>
       </w:r>
       <w:r>
         <w:rPr>
@@ -8043,7 +8062,7 @@
                 <w:sz w:val="21"/>
                 <w:szCs w:val="21"/>
               </w:rPr>
-              <w:t xml:space="preserve">Extract to a short folder such as </w:t>
+              <w:t xml:space="preserve">Make sure you are using </w:t>
             </w:r>
             <w:r>
               <w:rPr>
@@ -8052,15 +8071,33 @@
                 <w:sz w:val="19"/>
                 <w:szCs w:val="19"/>
               </w:rPr>
-              <w:t xml:space="preserve">C:\Audit\</w:t>
-            </w:r>
-            <w:r>
-              <w:rPr>
-                <w:rFonts w:ascii="Calibri" w:cs="Calibri" w:eastAsia="Calibri" w:hAnsi="Calibri"/>
-                <w:sz w:val="21"/>
-                <w:szCs w:val="21"/>
-              </w:rPr>
-              <w:t xml:space="preserve">. Make sure you are using </w:t>
+              <w:t xml:space="preserve">C7_v5.zip</w:t>
+            </w:r>
+            <w:r>
+              <w:rPr>
+                <w:rFonts w:ascii="Calibri" w:cs="Calibri" w:eastAsia="Calibri" w:hAnsi="Calibri"/>
+                <w:sz w:val="21"/>
+                <w:szCs w:val="21"/>
+              </w:rPr>
+              <w:t xml:space="preserve"> and </w:t>
+            </w:r>
+            <w:r>
+              <w:rPr>
+                <w:rFonts w:ascii="Calibri" w:cs="Calibri" w:eastAsia="Calibri" w:hAnsi="Calibri"/>
+                <w:b/>
+                <w:bCs/>
+                <w:sz w:val="21"/>
+                <w:szCs w:val="21"/>
+              </w:rPr>
+              <w:t xml:space="preserve">Extract All</w:t>
+            </w:r>
+            <w:r>
+              <w:rPr>
+                <w:rFonts w:ascii="Calibri" w:cs="Calibri" w:eastAsia="Calibri" w:hAnsi="Calibri"/>
+                <w:sz w:val="21"/>
+                <w:szCs w:val="21"/>
+              </w:rPr>
+              <w:t xml:space="preserve">. If the error names a long file such as </w:t>
             </w:r>
             <w:r>
               <w:rPr>
@@ -8069,15 +8106,33 @@
                 <w:sz w:val="19"/>
                 <w:szCs w:val="19"/>
               </w:rPr>
-              <w:t xml:space="preserve">BSI.IT.6.C7_FINAL_v4.zip</w:t>
-            </w:r>
-            <w:r>
-              <w:rPr>
-                <w:rFonts w:ascii="Calibri" w:cs="Calibri" w:eastAsia="Calibri" w:hAnsi="Calibri"/>
-                <w:sz w:val="21"/>
-                <w:szCs w:val="21"/>
-              </w:rPr>
-              <w:t xml:space="preserve">. If the error names a file starting with </w:t>
+              <w:t xml:space="preserve">DMA06_RE_ Management Attestation…</w:t>
+            </w:r>
+            <w:r>
+              <w:rPr>
+                <w:rFonts w:ascii="Calibri" w:cs="Calibri" w:eastAsia="Calibri" w:hAnsi="Calibri"/>
+                <w:sz w:val="21"/>
+                <w:szCs w:val="21"/>
+              </w:rPr>
+              <w:t xml:space="preserve">, it is coming from an </w:t>
+            </w:r>
+            <w:r>
+              <w:rPr>
+                <w:rFonts w:ascii="Calibri" w:cs="Calibri" w:eastAsia="Calibri" w:hAnsi="Calibri"/>
+                <w:b/>
+                <w:bCs/>
+                <w:sz w:val="21"/>
+                <w:szCs w:val="21"/>
+              </w:rPr>
+              <w:t xml:space="preserve">old copy</w:t>
+            </w:r>
+            <w:r>
+              <w:rPr>
+                <w:rFonts w:ascii="Calibri" w:cs="Calibri" w:eastAsia="Calibri" w:hAnsi="Calibri"/>
+                <w:sz w:val="21"/>
+                <w:szCs w:val="21"/>
+              </w:rPr>
+              <w:t xml:space="preserve">: delete every older zip and previously extracted folder, then extract </w:t>
             </w:r>
             <w:r>
               <w:rPr>
@@ -8086,50 +8141,15 @@
                 <w:sz w:val="19"/>
                 <w:szCs w:val="19"/>
               </w:rPr>
-              <w:t xml:space="preserve">DMA06_RE_ Management Attestation</w:t>
-            </w:r>
-            <w:r>
-              <w:rPr>
-                <w:rFonts w:ascii="Calibri" w:cs="Calibri" w:eastAsia="Calibri" w:hAnsi="Calibri"/>
-                <w:sz w:val="21"/>
-                <w:szCs w:val="21"/>
-              </w:rPr>
-              <w:t xml:space="preserve">, it is coming from an </w:t>
-            </w:r>
-            <w:r>
-              <w:rPr>
-                <w:rFonts w:ascii="Calibri" w:cs="Calibri" w:eastAsia="Calibri" w:hAnsi="Calibri"/>
-                <w:b/>
-                <w:bCs/>
-                <w:sz w:val="21"/>
-                <w:szCs w:val="21"/>
-              </w:rPr>
-              <w:t xml:space="preserve">old copy</w:t>
-            </w:r>
-            <w:r>
-              <w:rPr>
-                <w:rFonts w:ascii="Calibri" w:cs="Calibri" w:eastAsia="Calibri" w:hAnsi="Calibri"/>
-                <w:sz w:val="21"/>
-                <w:szCs w:val="21"/>
-              </w:rPr>
-              <w:t xml:space="preserve">: delete every older zip and previously extracted </w:t>
-            </w:r>
-            <w:r>
-              <w:rPr>
-                <w:rFonts w:ascii="Consolas" w:cs="Consolas" w:eastAsia="Consolas" w:hAnsi="Consolas"/>
-                <w:color w:val="2F5496"/>
-                <w:sz w:val="19"/>
-                <w:szCs w:val="19"/>
-              </w:rPr>
-              <w:t xml:space="preserve">BSI.IT.6.C7.3-Evidences</w:t>
-            </w:r>
-            <w:r>
-              <w:rPr>
-                <w:rFonts w:ascii="Calibri" w:cs="Calibri" w:eastAsia="Calibri" w:hAnsi="Calibri"/>
-                <w:sz w:val="21"/>
-                <w:szCs w:val="21"/>
-              </w:rPr>
-              <w:t xml:space="preserve"> folder, then extract v4 into an empty folder.</w:t>
+              <w:t xml:space="preserve">C7_v5.zip</w:t>
+            </w:r>
+            <w:r>
+              <w:rPr>
+                <w:rFonts w:ascii="Calibri" w:cs="Calibri" w:eastAsia="Calibri" w:hAnsi="Calibri"/>
+                <w:sz w:val="21"/>
+                <w:szCs w:val="21"/>
+              </w:rPr>
+              <w:t xml:space="preserve"> again.</w:t>
             </w:r>
           </w:p>
         </w:tc>
@@ -8190,7 +8210,7 @@
                 <w:sz w:val="21"/>
                 <w:szCs w:val="21"/>
               </w:rPr>
-              <w:t xml:space="preserve">You have the old package. Use the rebuilt </w:t>
+              <w:t xml:space="preserve">You have an old package. Use </w:t>
             </w:r>
             <w:r>
               <w:rPr>
@@ -8199,15 +8219,15 @@
                 <w:sz w:val="19"/>
                 <w:szCs w:val="19"/>
               </w:rPr>
-              <w:t xml:space="preserve">BSI.IT.6.C7_FINAL_v4.zip</w:t>
-            </w:r>
-            <w:r>
-              <w:rPr>
-                <w:rFonts w:ascii="Calibri" w:cs="Calibri" w:eastAsia="Calibri" w:hAnsi="Calibri"/>
-                <w:sz w:val="21"/>
-                <w:szCs w:val="21"/>
-              </w:rPr>
-              <w:t xml:space="preserve">, where all names use plain characters.</w:t>
+              <w:t xml:space="preserve">C7_v5.zip</w:t>
+            </w:r>
+            <w:r>
+              <w:rPr>
+                <w:rFonts w:ascii="Calibri" w:cs="Calibri" w:eastAsia="Calibri" w:hAnsi="Calibri"/>
+                <w:sz w:val="21"/>
+                <w:szCs w:val="21"/>
+              </w:rPr>
+              <w:t xml:space="preserve">, where all names are short and use plain characters.</w:t>
             </w:r>
           </w:p>
         </w:tc>

</xml_diff>